<commit_message>
feat: replace year 4 curriculum data, drop unrelated programs, add RAG ingest pipeline and app
Removes summer-term/old year-4 files in favor of new first/second semester year-4 data, drops non-CS program pages (education, English, political science, accounting, agriculture, criminology) from the scraped dataset, and adds the ingestion pipeline, RAG app, and LlamaIndex comparison scripts.

Co-Authored-By: Claude Sonnet 5 <noreply@anthropic.com>
Claude-Session: https://claude.ai/code/session_01E7atXnnmqRrrL2Ja9bfcob
</commit_message>
<xml_diff>
--- a/docs/Project_Proposal.docx
+++ b/docs/Project_Proposal.docx
@@ -1,6 +1,6 @@
 
 <file path=word/document.xml><?xml version="1.0" encoding="utf-8"?>
-<w:document xmlns:wpc="http://schemas.microsoft.com/office/word/2010/wordprocessingCanvas" xmlns:cx="http://schemas.microsoft.com/office/drawing/2014/chartex" xmlns:cx1="http://schemas.microsoft.com/office/drawing/2015/9/8/chartex" xmlns:cx2="http://schemas.microsoft.com/office/drawing/2015/10/21/chartex" xmlns:cx3="http://schemas.microsoft.com/office/drawing/2016/5/9/chartex" xmlns:cx4="http://schemas.microsoft.com/office/drawing/2016/5/10/chartex" xmlns:cx5="http://schemas.microsoft.com/office/drawing/2016/5/11/chartex" xmlns:cx6="http://schemas.microsoft.com/office/drawing/2016/5/12/chartex" xmlns:cx7="http://schemas.microsoft.com/office/drawing/2016/5/13/chartex" xmlns:cx8="http://schemas.microsoft.com/office/drawing/2016/5/14/chartex" xmlns:mc="http://schemas.openxmlformats.org/markup-compatibility/2006" xmlns:aink="http://schemas.microsoft.com/office/drawing/2016/ink" xmlns:am3d="http://schemas.microsoft.com/office/drawing/2017/model3d" xmlns:o="urn:schemas-microsoft-com:office:office" xmlns:oel="http://schemas.microsoft.com/office/2019/extlst" xmlns:r="http://schemas.openxmlformats.org/officeDocument/2006/relationships" xmlns:m="http://schemas.openxmlformats.org/officeDocument/2006/math" xmlns:v="urn:schemas-microsoft-com:vml" xmlns:wp14="http://schemas.microsoft.com/office/word/2010/wordprocessingDrawing" xmlns:wp="http://schemas.openxmlformats.org/drawingml/2006/wordprocessingDrawing" xmlns:w10="urn:schemas-microsoft-com:office:word" xmlns:w="http://schemas.openxmlformats.org/wordprocessingml/2006/main" xmlns:w14="http://schemas.microsoft.com/office/word/2010/wordml" xmlns:w15="http://schemas.microsoft.com/office/word/2012/wordml" xmlns:w16cex="http://schemas.microsoft.com/office/word/2018/wordml/cex" xmlns:w16cid="http://schemas.microsoft.com/office/word/2016/wordml/cid" xmlns:w16="http://schemas.microsoft.com/office/word/2018/wordml" xmlns:w16du="http://schemas.microsoft.com/office/word/2023/wordml/word16du" xmlns:w16sdtdh="http://schemas.microsoft.com/office/word/2020/wordml/sdtdatahash" xmlns:w16sdtfl="http://schemas.microsoft.com/office/word/2024/wordml/sdtformatlock" xmlns:w16se="http://schemas.microsoft.com/office/word/2015/wordml/symex" xmlns:wpg="http://schemas.microsoft.com/office/word/2010/wordprocessingGroup" xmlns:wpi="http://schemas.microsoft.com/office/word/2010/wordprocessingInk" xmlns:wne="http://schemas.microsoft.com/office/word/2006/wordml" xmlns:wps="http://schemas.microsoft.com/office/word/2010/wordprocessingShape" mc:Ignorable="w14 w15 w16se w16cid w16 w16cex w16sdtdh w16sdtfl w16du wp14">
+<w:document xmlns:wpc="http://schemas.microsoft.com/office/word/2010/wordprocessingCanvas" xmlns:cx="http://schemas.microsoft.com/office/drawing/2014/chartex" xmlns:cx1="http://schemas.microsoft.com/office/drawing/2015/9/8/chartex" xmlns:cx2="http://schemas.microsoft.com/office/drawing/2015/10/21/chartex" xmlns:cx3="http://schemas.microsoft.com/office/drawing/2016/5/9/chartex" xmlns:cx4="http://schemas.microsoft.com/office/drawing/2016/5/10/chartex" xmlns:cx5="http://schemas.microsoft.com/office/drawing/2016/5/11/chartex" xmlns:cx6="http://schemas.microsoft.com/office/drawing/2016/5/12/chartex" xmlns:cx7="http://schemas.microsoft.com/office/drawing/2016/5/13/chartex" xmlns:cx8="http://schemas.microsoft.com/office/drawing/2016/5/14/chartex" xmlns:mc="http://schemas.openxmlformats.org/markup-compatibility/2006" xmlns:aink="http://schemas.microsoft.com/office/drawing/2016/ink" xmlns:am3d="http://schemas.microsoft.com/office/drawing/2017/model3d" xmlns:o="urn:schemas-microsoft-com:office:office" xmlns:oel="http://schemas.microsoft.com/office/2019/extlst" xmlns:r="http://schemas.openxmlformats.org/officeDocument/2006/relationships" xmlns:m="http://schemas.openxmlformats.org/officeDocument/2006/math" xmlns:v="urn:schemas-microsoft-com:vml" xmlns:wp14="http://schemas.microsoft.com/office/word/2010/wordprocessingDrawing" xmlns:wp="http://schemas.openxmlformats.org/drawingml/2006/wordprocessingDrawing" xmlns:w10="urn:schemas-microsoft-com:office:word" xmlns:w="http://schemas.openxmlformats.org/wordprocessingml/2006/main" xmlns:w14="http://schemas.microsoft.com/office/word/2010/wordml" xmlns:w15="http://schemas.microsoft.com/office/word/2012/wordml" xmlns:w16cei="http://schemas.microsoft.com/office/word/2026/wordml/cei" xmlns:w16cex="http://schemas.microsoft.com/office/word/2018/wordml/cex" xmlns:w16cid="http://schemas.microsoft.com/office/word/2016/wordml/cid" xmlns:w16="http://schemas.microsoft.com/office/word/2018/wordml" xmlns:w16du="http://schemas.microsoft.com/office/word/2023/wordml/word16du" xmlns:w16sdtdh="http://schemas.microsoft.com/office/word/2020/wordml/sdtdatahash" xmlns:w16sdtfl="http://schemas.microsoft.com/office/word/2024/wordml/sdtformatlock" xmlns:w16se="http://schemas.microsoft.com/office/word/2015/wordml/symex" xmlns:wpg="http://schemas.microsoft.com/office/word/2010/wordprocessingGroup" xmlns:wpi="http://schemas.microsoft.com/office/word/2010/wordprocessingInk" xmlns:wne="http://schemas.microsoft.com/office/word/2006/wordml" xmlns:wps="http://schemas.microsoft.com/office/word/2010/wordprocessingShape" mc:Ignorable="w14 w15 w16se w16cid w16 w16cex w16sdtdh w16sdtfl w16du wp14">
   <w:background w:color="FFFFFF"/>
   <w:body>
     <w:p>
@@ -107,7 +107,7 @@
           <w:rFonts w:ascii="Arial" w:eastAsia="Arial" w:hAnsi="Arial" w:cs="Arial"/>
           <w:color w:val="000000"/>
         </w:rPr>
-        <w:t>Pathfinder: A RAG-based Academic Advisor for Course Planning</w:t>
+        <w:t>Pathfinder: A RAG-based Academic Advisor</w:t>
       </w:r>
       <w:r>
         <w:rPr>
@@ -152,6 +152,100 @@
     </w:p>
     <w:p>
       <w:pPr>
+        <w:numPr>
+          <w:ilvl w:val="0"/>
+          <w:numId w:val="1"/>
+        </w:numPr>
+      </w:pPr>
+      <w:r>
+        <w:rPr>
+          <w:rFonts w:ascii="Arial" w:eastAsia="Arial" w:hAnsi="Arial" w:cs="Arial"/>
+          <w:color w:val="000000"/>
+        </w:rPr>
+        <w:t>☐ Source Code Analyzer/Reviewer</w:t>
+      </w:r>
+    </w:p>
+    <w:p>
+      <w:pPr>
+        <w:numPr>
+          <w:ilvl w:val="0"/>
+          <w:numId w:val="1"/>
+        </w:numPr>
+      </w:pPr>
+      <w:r>
+        <w:rPr>
+          <w:rFonts w:ascii="Arial" w:eastAsia="Arial" w:hAnsi="Arial" w:cs="Arial"/>
+          <w:color w:val="000000"/>
+        </w:rPr>
+        <w:t>☐ Customer Support / FAQ Bot</w:t>
+      </w:r>
+    </w:p>
+    <w:p>
+      <w:pPr>
+        <w:numPr>
+          <w:ilvl w:val="0"/>
+          <w:numId w:val="1"/>
+        </w:numPr>
+      </w:pPr>
+      <w:r>
+        <w:rPr>
+          <w:rFonts w:ascii="Arial" w:eastAsia="Arial" w:hAnsi="Arial" w:cs="Arial"/>
+          <w:color w:val="000000"/>
+        </w:rPr>
+        <w:t>☐ Academic Research Assistant</w:t>
+      </w:r>
+    </w:p>
+    <w:p>
+      <w:pPr>
+        <w:numPr>
+          <w:ilvl w:val="0"/>
+          <w:numId w:val="1"/>
+        </w:numPr>
+      </w:pPr>
+      <w:r>
+        <w:rPr>
+          <w:rFonts w:ascii="Arial" w:eastAsia="Arial" w:hAnsi="Arial" w:cs="Arial"/>
+          <w:color w:val="000000"/>
+        </w:rPr>
+        <w:t>☐ Local Business / Community Assistant</w:t>
+      </w:r>
+    </w:p>
+    <w:p>
+      <w:pPr>
+        <w:numPr>
+          <w:ilvl w:val="0"/>
+          <w:numId w:val="1"/>
+        </w:numPr>
+      </w:pPr>
+      <w:r>
+        <w:rPr>
+          <w:rFonts w:ascii="Arial" w:eastAsia="Arial" w:hAnsi="Arial" w:cs="Arial"/>
+          <w:color w:val="000000"/>
+        </w:rPr>
+        <w:t>☐ Personal/Domain Notes Assistant</w:t>
+      </w:r>
+    </w:p>
+    <w:p>
+      <w:pPr>
+        <w:numPr>
+          <w:ilvl w:val="0"/>
+          <w:numId w:val="1"/>
+        </w:numPr>
+        <w:rPr>
+          <w:rFonts w:ascii="Arial" w:eastAsia="Arial" w:hAnsi="Arial" w:cs="Arial"/>
+          <w:color w:val="000000"/>
+        </w:rPr>
+      </w:pPr>
+      <w:r>
+        <w:rPr>
+          <w:rFonts w:ascii="Arial" w:eastAsia="Arial" w:hAnsi="Arial" w:cs="Arial"/>
+          <w:color w:val="000000"/>
+        </w:rPr>
+        <w:t>☐ Others (please specify): N/A</w:t>
+      </w:r>
+    </w:p>
+    <w:p>
+      <w:pPr>
         <w:widowControl w:val="0"/>
         <w:pBdr>
           <w:top w:val="nil"/>
@@ -179,30 +273,7 @@
           <w:rFonts w:ascii="Arial" w:eastAsia="Arial" w:hAnsi="Arial" w:cs="Arial"/>
           <w:color w:val="000000"/>
         </w:rPr>
-        <w:t>Repository Link</w:t>
-      </w:r>
-      <w:r>
-        <w:rPr>
-          <w:rFonts w:ascii="Arial" w:eastAsia="Arial" w:hAnsi="Arial" w:cs="Arial"/>
-          <w:color w:val="000000"/>
-        </w:rPr>
-        <w:t xml:space="preserve">  </w:t>
-      </w:r>
-      <w:hyperlink r:id="rId7" w:history="1">
-        <w:r>
-          <w:rPr>
-            <w:rStyle w:val="Hyperlink"/>
-            <w:rFonts w:ascii="Arial" w:eastAsia="Arial" w:hAnsi="Arial" w:cs="Arial"/>
-          </w:rPr>
-          <w:t>https://github.com/keivautier2428/Pathfinder-A-RAG-based-Academic-Advisor-for-Course-Planning.git</w:t>
-        </w:r>
-      </w:hyperlink>
-      <w:r>
-        <w:rPr>
-          <w:rFonts w:ascii="Arial" w:eastAsia="Arial" w:hAnsi="Arial" w:cs="Arial"/>
-          <w:color w:val="000000"/>
-        </w:rPr>
-        <w:t xml:space="preserve"> </w:t>
+        <w:t>Repository Link: https://github.com/&lt;your-team&gt;/pathfinder-rag-advisor (create before submission; all checkpoint commits live here per Section 7 of the Guide)</w:t>
       </w:r>
     </w:p>
     <w:p>
@@ -229,19 +300,17 @@
     </w:p>
     <w:p>
       <w:pPr>
-        <w:ind w:firstLine="720"/>
-        <w:jc w:val="both"/>
-        <w:rPr>
-          <w:rFonts w:ascii="Arial" w:eastAsia="Arial" w:hAnsi="Arial" w:cs="Arial"/>
-          <w:color w:val="000000"/>
-        </w:rPr>
-      </w:pPr>
-      <w:r>
-        <w:rPr>
-          <w:rFonts w:ascii="Arial" w:eastAsia="Arial" w:hAnsi="Arial" w:cs="Arial"/>
-          <w:color w:val="000000"/>
-        </w:rPr>
-        <w:t>At Talibon Polytechnic College (TPC), BSIS students plan their course loads and check their degree progress manually: cross-referencing a printed curriculum checklist, remembering which subjects are prerequisites for which, and asking the Program Head or Registrar's Office in person for anything not obvious from the checklist (unit caps under probation, GWA requirements for Latin honors, whether a grade of INC blocks enrollment in a follow-on course, etc.). This does not scale: the Program Head and Registrar's Office serve every student in the program with limited office hours, so students commonly enroll in courses whose prerequisites they have not completed, miscount their remaining units toward graduation, or simply do not find out about a policy (e.g. the probation unit cap) until it already affects them. Existing non-AI solutions - a static PDF/printed checklist and word-of-mouth from advisers - cannot answer a specific, personalized question ("Can I take IS301 next term if I haven't passed IS205 yet?") and cannot be queried outside office hours. Pathfinder addresses this by grounding a conversational assistant in TPC's actual BSIS curriculum structure and academic policies, so students get an accurate, cited answer to course-planning and degree-progress questions on demand.</w:t>
+        <w:rPr>
+          <w:rFonts w:ascii="Arial" w:eastAsia="Arial" w:hAnsi="Arial" w:cs="Arial"/>
+          <w:color w:val="000000"/>
+        </w:rPr>
+      </w:pPr>
+      <w:r>
+        <w:rPr>
+          <w:rFonts w:ascii="Arial" w:eastAsia="Arial" w:hAnsi="Arial" w:cs="Arial"/>
+          <w:color w:val="000000"/>
+        </w:rPr>
+        <w:t>At Talibon Polytechnic College (TPC), BSIS students plan their course loads and check their degree progress manually: cross-referencing a printed curriculum checklist, remembering which subjects are prerequisites for which, and asking the Program Head or Registrar's Office in person for anything not obvious from the checklist (unit caps under probation, GWA requirements for Latin honors, whether a grade of INC blocks enrollment in a follow-on course, etc.). This does not scale: the Program Head and Registrar's Office serve every student in the program with limited office hours, so students commonly enroll in courses whose prerequisites they have not completed, miscount their remaining units toward graduation, or simply do not find out about a policy (e.g. the probation unit cap) until it already affects them. Existing non-AI solutions - a static PDF/printed checklist and word-of-mouth from advisers - cannot answer a specific, personalized question ("Can I take CC 104 next term if I haven't passed CC 103 yet?") and cannot be queried outside office hours. Pathfinder addresses this by grounding a conversational assistant in TPC's actual BSIS curriculum structure and academic policies, so students get an accurate, cited answer to course-planning and degree-progress questions on demand.</w:t>
       </w:r>
     </w:p>
     <w:p>
@@ -268,27 +337,17 @@
     </w:p>
     <w:p>
       <w:pPr>
-        <w:ind w:firstLine="720"/>
-        <w:jc w:val="both"/>
-        <w:rPr>
-          <w:rFonts w:ascii="Arial" w:eastAsia="Arial" w:hAnsi="Arial" w:cs="Arial"/>
-          <w:color w:val="000000"/>
-        </w:rPr>
-      </w:pPr>
-      <w:r>
-        <w:rPr>
-          <w:rFonts w:ascii="Arial" w:eastAsia="Arial" w:hAnsi="Arial" w:cs="Arial"/>
-          <w:color w:val="000000"/>
-        </w:rPr>
-        <w:t xml:space="preserve">Primary users: current BSIS students at TPC, especially those who are enrolling, re-enrolling after a failed/dropped course, or nearing graduation and need to verify </w:t>
-      </w:r>
-      <w:r>
-        <w:rPr>
-          <w:rFonts w:ascii="Arial" w:eastAsia="Arial" w:hAnsi="Arial" w:cs="Arial"/>
-          <w:color w:val="000000"/>
-        </w:rPr>
-        <w:lastRenderedPageBreak/>
-        <w:t>remaining requirements. Secondary users: incoming/prospective BSIS students comparing program requirements before enrolling, and the Program Head/Registrar's Office staff, who can point students to the assistant for routine prerequisite and policy questions instead of answering them individually. For primary users, the tool replaces manually cross-referencing a paper checklist and waiting for office hours with an instant, always-available, source-cited answer; for staff, it reduces repetitive front-desk questions so office hours can focus on cases that genuinely need a human (petitions, waivers, appeals).</w:t>
+        <w:rPr>
+          <w:rFonts w:ascii="Arial" w:eastAsia="Arial" w:hAnsi="Arial" w:cs="Arial"/>
+          <w:color w:val="000000"/>
+        </w:rPr>
+      </w:pPr>
+      <w:r>
+        <w:rPr>
+          <w:rFonts w:ascii="Arial" w:eastAsia="Arial" w:hAnsi="Arial" w:cs="Arial"/>
+          <w:color w:val="000000"/>
+        </w:rPr>
+        <w:t>Primary users: current BSIS students at TPC, especially those who are enrolling, re-enrolling after a failed/dropped course, or nearing graduation and need to verify remaining requirements. Secondary users: incoming/prospective BSIS students comparing program requirements before enrolling, and the Program Head/Registrar's Office staff, who can point students to the assistant for routine prerequisite and policy questions instead of answering them individually. For primary users, the tool replaces manually cross-referencing a paper checklist and waiting for office hours with an instant, always-available, source-cited answer; for staff, it reduces repetitive front-desk questions so office hours can focus on cases that genuinely need a human (petitions, waivers, appeals).</w:t>
       </w:r>
     </w:p>
     <w:p>
@@ -315,25 +374,17 @@
     </w:p>
     <w:p>
       <w:pPr>
-        <w:jc w:val="both"/>
-        <w:rPr>
-          <w:rFonts w:ascii="Arial" w:eastAsia="Arial" w:hAnsi="Arial" w:cs="Arial"/>
-          <w:color w:val="000000"/>
-        </w:rPr>
-      </w:pPr>
-      <w:r>
-        <w:rPr>
-          <w:rFonts w:ascii="Arial" w:eastAsia="Arial" w:hAnsi="Arial" w:cs="Arial"/>
-          <w:color w:val="000000"/>
-        </w:rPr>
-        <w:tab/>
-      </w:r>
-      <w:r>
-        <w:rPr>
-          <w:rFonts w:ascii="Arial" w:eastAsia="Arial" w:hAnsi="Arial" w:cs="Arial"/>
-          <w:color w:val="000000"/>
-        </w:rPr>
-        <w:t>The knowledge base combines two kinds of sources, documented in full in docs/Data_Sources.md: (1) real content scraped from TPC's public website (tpc.edu.ph) - program descriptions, program leadership, admission requirements, enrollment process, and student services info; and (2) a simulated BSIS curriculum checklist and academic policy set, since TPC's actual registrar prospectus is not published online. The simulated documents are modeled on CHED Memorandum Order No. 25, s. 2015 (the real national policy standard for BSIS program design in the Philippines) and are clearly labeled [SIMULATED DATA] in-file and in the README.</w:t>
+        <w:rPr>
+          <w:rFonts w:ascii="Arial" w:eastAsia="Arial" w:hAnsi="Arial" w:cs="Arial"/>
+          <w:color w:val="000000"/>
+        </w:rPr>
+      </w:pPr>
+      <w:r>
+        <w:rPr>
+          <w:rFonts w:ascii="Arial" w:eastAsia="Arial" w:hAnsi="Arial" w:cs="Arial"/>
+          <w:color w:val="000000"/>
+        </w:rPr>
+        <w:t>The knowledge base combines three kinds of sources, documented in full in docs/Data_Sources.md: (1) real content scraped from TPC's public website (tpc.edu.ph) - program descriptions, program leadership, admission requirements, enrollment process, and student services info; (2) TPC's official BSIS curriculum checklist (effective A.Y. 2024-2025), transcribed from a printed, signed copy obtained directly, since TPC does not publish it online - real course codes, titles, units, and prerequisites, labeled [REAL DATA]; and (3) a simulated course-description catalog and academic policy set (grading/GWA, enrollment/academic standing), since TPC's full student handbook is not accessible, clearly labeled [SIMULATED DATA] in-file and in the README.</w:t>
       </w:r>
     </w:p>
     <w:p>
@@ -374,7 +425,7 @@
           <w:rFonts w:ascii="Arial" w:eastAsia="Arial" w:hAnsi="Arial" w:cs="Arial"/>
           <w:color w:val="000000"/>
         </w:rPr>
-        <w:t xml:space="preserve"> Plain text (.txt), scraped from HTML and generated from structured Python data.</w:t>
+        <w:t xml:space="preserve"> Plain text (.txt), scraped from HTML, transcribed from a printed document, and generated from structured Python data.</w:t>
       </w:r>
     </w:p>
     <w:p>
@@ -391,6 +442,7 @@
           <w:bCs/>
           <w:color w:val="000000"/>
         </w:rPr>
+        <w:lastRenderedPageBreak/>
         <w:t>Source:</w:t>
       </w:r>
       <w:r>
@@ -398,7 +450,21 @@
           <w:rFonts w:ascii="Arial" w:eastAsia="Arial" w:hAnsi="Arial" w:cs="Arial"/>
           <w:color w:val="000000"/>
         </w:rPr>
-        <w:t xml:space="preserve"> tpc.edu.ph (public website, real) + a CHED CMO No. 25 s.2015 - based simulated curriculum/policy set (clearly labeled).</w:t>
+        <w:t xml:space="preserve"> tpc.edu.ph (public website, real) + TPC's official BSIS curriculum checklist (real, printed copy) + a simulated course-description/policy set (clearly labeled).</w:t>
+      </w:r>
+      <w:proofErr w:type="gramStart"/>
+      <w:r>
+        <w:rPr>
+          <w:rFonts w:ascii="Arial" w:eastAsia="Arial" w:hAnsi="Arial" w:cs="Arial"/>
+          <w:color w:val="000000"/>
+        </w:rPr>
+      </w:r>
+      <w:proofErr w:type="gramEnd"/>
+      <w:r>
+        <w:rPr>
+          <w:rFonts w:ascii="Arial" w:eastAsia="Arial" w:hAnsi="Arial" w:cs="Arial"/>
+          <w:color w:val="000000"/>
+        </w:rPr>
       </w:r>
     </w:p>
     <w:p>
@@ -422,34 +488,27 @@
           <w:rFonts w:ascii="Arial" w:eastAsia="Arial" w:hAnsi="Arial" w:cs="Arial"/>
           <w:color w:val="000000"/>
         </w:rPr>
-        <w:t xml:space="preserve"> 30 documents total: 16 real scraped pages + 9 curriculum-checklist documents + 3 course-description catalogs + 2 policy documents.</w:t>
-      </w:r>
-    </w:p>
-    <w:p>
-      <w:pPr>
-        <w:rPr>
-          <w:rFonts w:ascii="Arial" w:eastAsia="Arial" w:hAnsi="Arial" w:cs="Arial"/>
-          <w:color w:val="000000"/>
+        <w:t xml:space="preserve"> 23 documents total: 10 real scraped pages + 8 real curriculum-checklist documents + 3 course-description catalogs + 2 policy documents.</w:t>
+      </w:r>
+    </w:p>
+    <w:p>
+      <w:pPr>
+        <w:pStyle w:val="Title"/>
+        <w:rPr>
+          <w:rFonts w:ascii="Arial" w:eastAsia="Arial" w:hAnsi="Arial" w:cs="Arial"/>
+          <w:color w:val="000000"/>
+          <w:sz w:val="24"/>
+          <w:szCs w:val="24"/>
         </w:rPr>
       </w:pPr>
       <w:bookmarkStart w:id="6" w:name="_12e8y6cs3gz3" w:colFirst="0" w:colLast="0"/>
       <w:bookmarkEnd w:id="6"/>
-    </w:p>
-    <w:p>
-      <w:pPr>
-        <w:rPr>
-          <w:rFonts w:ascii="Arial" w:eastAsia="Arial" w:hAnsi="Arial" w:cs="Arial"/>
-          <w:b/>
-          <w:bCs/>
-          <w:color w:val="000000"/>
-        </w:rPr>
-      </w:pPr>
-      <w:r>
-        <w:rPr>
-          <w:rFonts w:ascii="Arial" w:eastAsia="Arial" w:hAnsi="Arial" w:cs="Arial"/>
-          <w:b/>
-          <w:bCs/>
-          <w:color w:val="000000"/>
+      <w:r>
+        <w:rPr>
+          <w:rFonts w:ascii="Arial" w:eastAsia="Arial" w:hAnsi="Arial" w:cs="Arial"/>
+          <w:color w:val="000000"/>
+          <w:sz w:val="24"/>
+          <w:szCs w:val="24"/>
         </w:rPr>
         <w:t>5. Success Criteria</w:t>
       </w:r>
@@ -555,7 +614,7 @@
           <w:rFonts w:ascii="Arial" w:eastAsia="Arial" w:hAnsi="Arial" w:cs="Arial"/>
           <w:color w:val="000000"/>
         </w:rPr>
-        <w:t xml:space="preserve"> the assistant correctly answers at least 5 realistic multi-part advising questions (e.g. "Can I take IS301 if I haven't passed IS205?") without hallucinating a course, code, or policy that isn't in the knowledge base.</w:t>
+        <w:t xml:space="preserve"> the assistant correctly answers at least 5 realistic multi-part advising questions (e.g. "Can I take CC 104 if I haven't passed CC 103?") without hallucinating a course, code, or policy that isn't in the knowledge base.</w:t>
       </w:r>
     </w:p>
     <w:p>
@@ -572,15 +631,13 @@
           <w:bCs/>
           <w:color w:val="000000"/>
         </w:rPr>
-        <w:lastRenderedPageBreak/>
-        <w:t xml:space="preserve">Refusal Correctness: </w:t>
-      </w:r>
-      <w:r>
-        <w:rPr>
-          <w:rFonts w:ascii="Arial" w:eastAsia="Arial" w:hAnsi="Arial" w:cs="Arial"/>
-          <w:color w:val="000000"/>
-        </w:rPr>
-        <w:t>the assistant correctly declines or flags at least 1 out-of-scope/unanswerable query per demo session instead of guessing.</w:t>
+        <w:t>Refusal Correctness: the assistant correctly declines or flags at least 1 out-of-scope/unanswerable query per demo session instead of guessing.</w:t>
+      </w:r>
+      <w:r>
+        <w:rPr>
+          <w:rFonts w:ascii="Arial" w:eastAsia="Arial" w:hAnsi="Arial" w:cs="Arial"/>
+          <w:color w:val="000000"/>
+        </w:rPr>
       </w:r>
     </w:p>
     <w:p>
@@ -597,14 +654,13 @@
           <w:bCs/>
           <w:color w:val="000000"/>
         </w:rPr>
-        <w:t xml:space="preserve">Coverage: </w:t>
-      </w:r>
-      <w:r>
-        <w:rPr>
-          <w:rFonts w:ascii="Arial" w:eastAsia="Arial" w:hAnsi="Arial" w:cs="Arial"/>
-          <w:color w:val="000000"/>
-        </w:rPr>
-        <w:t>all four BSIS year levels (1-4) and both simulated policy documents are each retrieved correctly at least once across the demo query set.</w:t>
+        <w:t>Coverage: all four BSIS year levels (1-4) and both simulated policy documents are each retrieved correctly at least once across the demo query set.</w:t>
+      </w:r>
+      <w:r>
+        <w:rPr>
+          <w:rFonts w:ascii="Arial" w:eastAsia="Arial" w:hAnsi="Arial" w:cs="Arial"/>
+          <w:color w:val="000000"/>
+        </w:rPr>
       </w:r>
     </w:p>
     <w:p>
@@ -770,10 +826,7 @@
           </w:tcPr>
           <w:p>
             <w:r>
-              <w:rPr>
-                <w:rFonts w:ascii="Arial" w:eastAsia="Arial" w:hAnsi="Arial" w:cs="Arial"/>
-              </w:rPr>
-              <w:t>Peter Paul Polestico</w:t>
+              <w:t>[Team Member 1 - Your Name]</w:t>
             </w:r>
           </w:p>
         </w:tc>
@@ -843,19 +896,8 @@
           </w:tcPr>
           <w:p>
             <w:r>
-              <w:rPr>
-                <w:rFonts w:ascii="Arial" w:eastAsia="Arial" w:hAnsi="Arial" w:cs="Arial"/>
-              </w:rPr>
-              <w:t xml:space="preserve">Ken T. </w:t>
+              <w:t>[Team Member 2]</w:t>
             </w:r>
-            <w:proofErr w:type="spellStart"/>
-            <w:r>
-              <w:rPr>
-                <w:rFonts w:ascii="Arial" w:eastAsia="Arial" w:hAnsi="Arial" w:cs="Arial"/>
-              </w:rPr>
-              <w:t>Lubrico</w:t>
-            </w:r>
-            <w:proofErr w:type="spellEnd"/>
           </w:p>
         </w:tc>
         <w:tc>
@@ -923,19 +965,8 @@
             </w:tcBorders>
           </w:tcPr>
           <w:p>
-            <w:proofErr w:type="spellStart"/>
             <w:r>
-              <w:rPr>
-                <w:rFonts w:ascii="Arial" w:eastAsia="Arial" w:hAnsi="Arial" w:cs="Arial"/>
-              </w:rPr>
-              <w:t>Johnro</w:t>
-            </w:r>
-            <w:proofErr w:type="spellEnd"/>
-            <w:r>
-              <w:rPr>
-                <w:rFonts w:ascii="Arial" w:eastAsia="Arial" w:hAnsi="Arial" w:cs="Arial"/>
-              </w:rPr>
-              <w:t xml:space="preserve"> Balingit</w:t>
+              <w:t>[Team Member 3]</w:t>
             </w:r>
           </w:p>
         </w:tc>
@@ -1002,7 +1033,7 @@
       </w:pPr>
     </w:p>
     <w:sectPr>
-      <w:headerReference w:type="default" r:id="rId8"/>
+      <w:headerReference w:type="default" r:id="rId7"/>
       <w:pgSz w:w="12240" w:h="15840"/>
       <w:pgMar w:top="1440" w:right="1440" w:bottom="1440" w:left="1440" w:header="720" w:footer="720" w:gutter="0"/>
       <w:pgNumType w:start="1"/>
@@ -1013,7 +1044,7 @@
 </file>
 
 <file path=word/endnotes.xml><?xml version="1.0" encoding="utf-8"?>
-<w:endnotes xmlns:wpc="http://schemas.microsoft.com/office/word/2010/wordprocessingCanvas" xmlns:cx="http://schemas.microsoft.com/office/drawing/2014/chartex" xmlns:cx1="http://schemas.microsoft.com/office/drawing/2015/9/8/chartex" xmlns:cx2="http://schemas.microsoft.com/office/drawing/2015/10/21/chartex" xmlns:cx3="http://schemas.microsoft.com/office/drawing/2016/5/9/chartex" xmlns:cx4="http://schemas.microsoft.com/office/drawing/2016/5/10/chartex" xmlns:cx5="http://schemas.microsoft.com/office/drawing/2016/5/11/chartex" xmlns:cx6="http://schemas.microsoft.com/office/drawing/2016/5/12/chartex" xmlns:cx7="http://schemas.microsoft.com/office/drawing/2016/5/13/chartex" xmlns:cx8="http://schemas.microsoft.com/office/drawing/2016/5/14/chartex" xmlns:mc="http://schemas.openxmlformats.org/markup-compatibility/2006" xmlns:aink="http://schemas.microsoft.com/office/drawing/2016/ink" xmlns:am3d="http://schemas.microsoft.com/office/drawing/2017/model3d" xmlns:o="urn:schemas-microsoft-com:office:office" xmlns:oel="http://schemas.microsoft.com/office/2019/extlst" xmlns:r="http://schemas.openxmlformats.org/officeDocument/2006/relationships" xmlns:m="http://schemas.openxmlformats.org/officeDocument/2006/math" xmlns:v="urn:schemas-microsoft-com:vml" xmlns:wp14="http://schemas.microsoft.com/office/word/2010/wordprocessingDrawing" xmlns:wp="http://schemas.openxmlformats.org/drawingml/2006/wordprocessingDrawing" xmlns:w10="urn:schemas-microsoft-com:office:word" xmlns:w="http://schemas.openxmlformats.org/wordprocessingml/2006/main" xmlns:w14="http://schemas.microsoft.com/office/word/2010/wordml" xmlns:w15="http://schemas.microsoft.com/office/word/2012/wordml" xmlns:w16cex="http://schemas.microsoft.com/office/word/2018/wordml/cex" xmlns:w16cid="http://schemas.microsoft.com/office/word/2016/wordml/cid" xmlns:w16="http://schemas.microsoft.com/office/word/2018/wordml" xmlns:w16du="http://schemas.microsoft.com/office/word/2023/wordml/word16du" xmlns:w16sdtdh="http://schemas.microsoft.com/office/word/2020/wordml/sdtdatahash" xmlns:w16sdtfl="http://schemas.microsoft.com/office/word/2024/wordml/sdtformatlock" xmlns:w16se="http://schemas.microsoft.com/office/word/2015/wordml/symex" xmlns:wpg="http://schemas.microsoft.com/office/word/2010/wordprocessingGroup" xmlns:wpi="http://schemas.microsoft.com/office/word/2010/wordprocessingInk" xmlns:wne="http://schemas.microsoft.com/office/word/2006/wordml" xmlns:wps="http://schemas.microsoft.com/office/word/2010/wordprocessingShape" mc:Ignorable="w14 w15 w16se w16cid w16 w16cex w16sdtdh w16sdtfl w16du wp14">
+<w:endnotes xmlns:wpc="http://schemas.microsoft.com/office/word/2010/wordprocessingCanvas" xmlns:cx="http://schemas.microsoft.com/office/drawing/2014/chartex" xmlns:cx1="http://schemas.microsoft.com/office/drawing/2015/9/8/chartex" xmlns:cx2="http://schemas.microsoft.com/office/drawing/2015/10/21/chartex" xmlns:cx3="http://schemas.microsoft.com/office/drawing/2016/5/9/chartex" xmlns:cx4="http://schemas.microsoft.com/office/drawing/2016/5/10/chartex" xmlns:cx5="http://schemas.microsoft.com/office/drawing/2016/5/11/chartex" xmlns:cx6="http://schemas.microsoft.com/office/drawing/2016/5/12/chartex" xmlns:cx7="http://schemas.microsoft.com/office/drawing/2016/5/13/chartex" xmlns:cx8="http://schemas.microsoft.com/office/drawing/2016/5/14/chartex" xmlns:mc="http://schemas.openxmlformats.org/markup-compatibility/2006" xmlns:aink="http://schemas.microsoft.com/office/drawing/2016/ink" xmlns:am3d="http://schemas.microsoft.com/office/drawing/2017/model3d" xmlns:o="urn:schemas-microsoft-com:office:office" xmlns:oel="http://schemas.microsoft.com/office/2019/extlst" xmlns:r="http://schemas.openxmlformats.org/officeDocument/2006/relationships" xmlns:m="http://schemas.openxmlformats.org/officeDocument/2006/math" xmlns:v="urn:schemas-microsoft-com:vml" xmlns:wp14="http://schemas.microsoft.com/office/word/2010/wordprocessingDrawing" xmlns:wp="http://schemas.openxmlformats.org/drawingml/2006/wordprocessingDrawing" xmlns:w10="urn:schemas-microsoft-com:office:word" xmlns:w="http://schemas.openxmlformats.org/wordprocessingml/2006/main" xmlns:w14="http://schemas.microsoft.com/office/word/2010/wordml" xmlns:w15="http://schemas.microsoft.com/office/word/2012/wordml" xmlns:w16cei="http://schemas.microsoft.com/office/word/2026/wordml/cei" xmlns:w16cex="http://schemas.microsoft.com/office/word/2018/wordml/cex" xmlns:w16cid="http://schemas.microsoft.com/office/word/2016/wordml/cid" xmlns:w16="http://schemas.microsoft.com/office/word/2018/wordml" xmlns:w16du="http://schemas.microsoft.com/office/word/2023/wordml/word16du" xmlns:w16sdtdh="http://schemas.microsoft.com/office/word/2020/wordml/sdtdatahash" xmlns:w16sdtfl="http://schemas.microsoft.com/office/word/2024/wordml/sdtformatlock" xmlns:w16se="http://schemas.microsoft.com/office/word/2015/wordml/symex" xmlns:wpg="http://schemas.microsoft.com/office/word/2010/wordprocessingGroup" xmlns:wpi="http://schemas.microsoft.com/office/word/2010/wordprocessingInk" xmlns:wne="http://schemas.microsoft.com/office/word/2006/wordml" xmlns:wps="http://schemas.microsoft.com/office/word/2010/wordprocessingShape" mc:Ignorable="w14 w15 w16se w16cid w16 w16cex w16sdtdh w16sdtfl w16du wp14">
   <w:endnote w:type="separator" w:id="-1">
     <w:p>
       <w:pPr>
@@ -1038,7 +1069,7 @@
 </file>
 
 <file path=word/footnotes.xml><?xml version="1.0" encoding="utf-8"?>
-<w:footnotes xmlns:wpc="http://schemas.microsoft.com/office/word/2010/wordprocessingCanvas" xmlns:cx="http://schemas.microsoft.com/office/drawing/2014/chartex" xmlns:cx1="http://schemas.microsoft.com/office/drawing/2015/9/8/chartex" xmlns:cx2="http://schemas.microsoft.com/office/drawing/2015/10/21/chartex" xmlns:cx3="http://schemas.microsoft.com/office/drawing/2016/5/9/chartex" xmlns:cx4="http://schemas.microsoft.com/office/drawing/2016/5/10/chartex" xmlns:cx5="http://schemas.microsoft.com/office/drawing/2016/5/11/chartex" xmlns:cx6="http://schemas.microsoft.com/office/drawing/2016/5/12/chartex" xmlns:cx7="http://schemas.microsoft.com/office/drawing/2016/5/13/chartex" xmlns:cx8="http://schemas.microsoft.com/office/drawing/2016/5/14/chartex" xmlns:mc="http://schemas.openxmlformats.org/markup-compatibility/2006" xmlns:aink="http://schemas.microsoft.com/office/drawing/2016/ink" xmlns:am3d="http://schemas.microsoft.com/office/drawing/2017/model3d" xmlns:o="urn:schemas-microsoft-com:office:office" xmlns:oel="http://schemas.microsoft.com/office/2019/extlst" xmlns:r="http://schemas.openxmlformats.org/officeDocument/2006/relationships" xmlns:m="http://schemas.openxmlformats.org/officeDocument/2006/math" xmlns:v="urn:schemas-microsoft-com:vml" xmlns:wp14="http://schemas.microsoft.com/office/word/2010/wordprocessingDrawing" xmlns:wp="http://schemas.openxmlformats.org/drawingml/2006/wordprocessingDrawing" xmlns:w10="urn:schemas-microsoft-com:office:word" xmlns:w="http://schemas.openxmlformats.org/wordprocessingml/2006/main" xmlns:w14="http://schemas.microsoft.com/office/word/2010/wordml" xmlns:w15="http://schemas.microsoft.com/office/word/2012/wordml" xmlns:w16cex="http://schemas.microsoft.com/office/word/2018/wordml/cex" xmlns:w16cid="http://schemas.microsoft.com/office/word/2016/wordml/cid" xmlns:w16="http://schemas.microsoft.com/office/word/2018/wordml" xmlns:w16du="http://schemas.microsoft.com/office/word/2023/wordml/word16du" xmlns:w16sdtdh="http://schemas.microsoft.com/office/word/2020/wordml/sdtdatahash" xmlns:w16sdtfl="http://schemas.microsoft.com/office/word/2024/wordml/sdtformatlock" xmlns:w16se="http://schemas.microsoft.com/office/word/2015/wordml/symex" xmlns:wpg="http://schemas.microsoft.com/office/word/2010/wordprocessingGroup" xmlns:wpi="http://schemas.microsoft.com/office/word/2010/wordprocessingInk" xmlns:wne="http://schemas.microsoft.com/office/word/2006/wordml" xmlns:wps="http://schemas.microsoft.com/office/word/2010/wordprocessingShape" mc:Ignorable="w14 w15 w16se w16cid w16 w16cex w16sdtdh w16sdtfl w16du wp14">
+<w:footnotes xmlns:wpc="http://schemas.microsoft.com/office/word/2010/wordprocessingCanvas" xmlns:cx="http://schemas.microsoft.com/office/drawing/2014/chartex" xmlns:cx1="http://schemas.microsoft.com/office/drawing/2015/9/8/chartex" xmlns:cx2="http://schemas.microsoft.com/office/drawing/2015/10/21/chartex" xmlns:cx3="http://schemas.microsoft.com/office/drawing/2016/5/9/chartex" xmlns:cx4="http://schemas.microsoft.com/office/drawing/2016/5/10/chartex" xmlns:cx5="http://schemas.microsoft.com/office/drawing/2016/5/11/chartex" xmlns:cx6="http://schemas.microsoft.com/office/drawing/2016/5/12/chartex" xmlns:cx7="http://schemas.microsoft.com/office/drawing/2016/5/13/chartex" xmlns:cx8="http://schemas.microsoft.com/office/drawing/2016/5/14/chartex" xmlns:mc="http://schemas.openxmlformats.org/markup-compatibility/2006" xmlns:aink="http://schemas.microsoft.com/office/drawing/2016/ink" xmlns:am3d="http://schemas.microsoft.com/office/drawing/2017/model3d" xmlns:o="urn:schemas-microsoft-com:office:office" xmlns:oel="http://schemas.microsoft.com/office/2019/extlst" xmlns:r="http://schemas.openxmlformats.org/officeDocument/2006/relationships" xmlns:m="http://schemas.openxmlformats.org/officeDocument/2006/math" xmlns:v="urn:schemas-microsoft-com:vml" xmlns:wp14="http://schemas.microsoft.com/office/word/2010/wordprocessingDrawing" xmlns:wp="http://schemas.openxmlformats.org/drawingml/2006/wordprocessingDrawing" xmlns:w10="urn:schemas-microsoft-com:office:word" xmlns:w="http://schemas.openxmlformats.org/wordprocessingml/2006/main" xmlns:w14="http://schemas.microsoft.com/office/word/2010/wordml" xmlns:w15="http://schemas.microsoft.com/office/word/2012/wordml" xmlns:w16cei="http://schemas.microsoft.com/office/word/2026/wordml/cei" xmlns:w16cex="http://schemas.microsoft.com/office/word/2018/wordml/cex" xmlns:w16cid="http://schemas.microsoft.com/office/word/2016/wordml/cid" xmlns:w16="http://schemas.microsoft.com/office/word/2018/wordml" xmlns:w16du="http://schemas.microsoft.com/office/word/2023/wordml/word16du" xmlns:w16sdtdh="http://schemas.microsoft.com/office/word/2020/wordml/sdtdatahash" xmlns:w16sdtfl="http://schemas.microsoft.com/office/word/2024/wordml/sdtformatlock" xmlns:w16se="http://schemas.microsoft.com/office/word/2015/wordml/symex" xmlns:wpg="http://schemas.microsoft.com/office/word/2010/wordprocessingGroup" xmlns:wpi="http://schemas.microsoft.com/office/word/2010/wordprocessingInk" xmlns:wne="http://schemas.microsoft.com/office/word/2006/wordml" xmlns:wps="http://schemas.microsoft.com/office/word/2010/wordprocessingShape" mc:Ignorable="w14 w15 w16se w16cid w16 w16cex w16sdtdh w16sdtfl w16du wp14">
   <w:footnote w:type="separator" w:id="-1">
     <w:p>
       <w:pPr>
@@ -1063,13 +1094,13 @@
 </file>
 
 <file path=word/header1.xml><?xml version="1.0" encoding="utf-8"?>
-<w:hdr xmlns:wpc="http://schemas.microsoft.com/office/word/2010/wordprocessingCanvas" xmlns:cx="http://schemas.microsoft.com/office/drawing/2014/chartex" xmlns:cx1="http://schemas.microsoft.com/office/drawing/2015/9/8/chartex" xmlns:cx2="http://schemas.microsoft.com/office/drawing/2015/10/21/chartex" xmlns:cx3="http://schemas.microsoft.com/office/drawing/2016/5/9/chartex" xmlns:cx4="http://schemas.microsoft.com/office/drawing/2016/5/10/chartex" xmlns:cx5="http://schemas.microsoft.com/office/drawing/2016/5/11/chartex" xmlns:cx6="http://schemas.microsoft.com/office/drawing/2016/5/12/chartex" xmlns:cx7="http://schemas.microsoft.com/office/drawing/2016/5/13/chartex" xmlns:cx8="http://schemas.microsoft.com/office/drawing/2016/5/14/chartex" xmlns:mc="http://schemas.openxmlformats.org/markup-compatibility/2006" xmlns:aink="http://schemas.microsoft.com/office/drawing/2016/ink" xmlns:am3d="http://schemas.microsoft.com/office/drawing/2017/model3d" xmlns:o="urn:schemas-microsoft-com:office:office" xmlns:oel="http://schemas.microsoft.com/office/2019/extlst" xmlns:r="http://schemas.openxmlformats.org/officeDocument/2006/relationships" xmlns:m="http://schemas.openxmlformats.org/officeDocument/2006/math" xmlns:v="urn:schemas-microsoft-com:vml" xmlns:wp14="http://schemas.microsoft.com/office/word/2010/wordprocessingDrawing" xmlns:wp="http://schemas.openxmlformats.org/drawingml/2006/wordprocessingDrawing" xmlns:w10="urn:schemas-microsoft-com:office:word" xmlns:w="http://schemas.openxmlformats.org/wordprocessingml/2006/main" xmlns:w14="http://schemas.microsoft.com/office/word/2010/wordml" xmlns:w15="http://schemas.microsoft.com/office/word/2012/wordml" xmlns:w16cex="http://schemas.microsoft.com/office/word/2018/wordml/cex" xmlns:w16cid="http://schemas.microsoft.com/office/word/2016/wordml/cid" xmlns:w16="http://schemas.microsoft.com/office/word/2018/wordml" xmlns:w16du="http://schemas.microsoft.com/office/word/2023/wordml/word16du" xmlns:w16sdtdh="http://schemas.microsoft.com/office/word/2020/wordml/sdtdatahash" xmlns:w16sdtfl="http://schemas.microsoft.com/office/word/2024/wordml/sdtformatlock" xmlns:w16se="http://schemas.microsoft.com/office/word/2015/wordml/symex" xmlns:wpg="http://schemas.microsoft.com/office/word/2010/wordprocessingGroup" xmlns:wpi="http://schemas.microsoft.com/office/word/2010/wordprocessingInk" xmlns:wne="http://schemas.microsoft.com/office/word/2006/wordml" xmlns:wps="http://schemas.microsoft.com/office/word/2010/wordprocessingShape" mc:Ignorable="w14 w15 w16se w16cid w16 w16cex w16sdtdh w16sdtfl w16du wp14">
+<w:hdr xmlns:wpc="http://schemas.microsoft.com/office/word/2010/wordprocessingCanvas" xmlns:cx="http://schemas.microsoft.com/office/drawing/2014/chartex" xmlns:cx1="http://schemas.microsoft.com/office/drawing/2015/9/8/chartex" xmlns:cx2="http://schemas.microsoft.com/office/drawing/2015/10/21/chartex" xmlns:cx3="http://schemas.microsoft.com/office/drawing/2016/5/9/chartex" xmlns:cx4="http://schemas.microsoft.com/office/drawing/2016/5/10/chartex" xmlns:cx5="http://schemas.microsoft.com/office/drawing/2016/5/11/chartex" xmlns:cx6="http://schemas.microsoft.com/office/drawing/2016/5/12/chartex" xmlns:cx7="http://schemas.microsoft.com/office/drawing/2016/5/13/chartex" xmlns:cx8="http://schemas.microsoft.com/office/drawing/2016/5/14/chartex" xmlns:mc="http://schemas.openxmlformats.org/markup-compatibility/2006" xmlns:aink="http://schemas.microsoft.com/office/drawing/2016/ink" xmlns:am3d="http://schemas.microsoft.com/office/drawing/2017/model3d" xmlns:o="urn:schemas-microsoft-com:office:office" xmlns:oel="http://schemas.microsoft.com/office/2019/extlst" xmlns:r="http://schemas.openxmlformats.org/officeDocument/2006/relationships" xmlns:m="http://schemas.openxmlformats.org/officeDocument/2006/math" xmlns:v="urn:schemas-microsoft-com:vml" xmlns:wp14="http://schemas.microsoft.com/office/word/2010/wordprocessingDrawing" xmlns:wp="http://schemas.openxmlformats.org/drawingml/2006/wordprocessingDrawing" xmlns:w10="urn:schemas-microsoft-com:office:word" xmlns:w="http://schemas.openxmlformats.org/wordprocessingml/2006/main" xmlns:w14="http://schemas.microsoft.com/office/word/2010/wordml" xmlns:w15="http://schemas.microsoft.com/office/word/2012/wordml" xmlns:w16cei="http://schemas.microsoft.com/office/word/2026/wordml/cei" xmlns:w16cex="http://schemas.microsoft.com/office/word/2018/wordml/cex" xmlns:w16cid="http://schemas.microsoft.com/office/word/2016/wordml/cid" xmlns:w16="http://schemas.microsoft.com/office/word/2018/wordml" xmlns:w16du="http://schemas.microsoft.com/office/word/2023/wordml/word16du" xmlns:w16sdtdh="http://schemas.microsoft.com/office/word/2020/wordml/sdtdatahash" xmlns:w16sdtfl="http://schemas.microsoft.com/office/word/2024/wordml/sdtformatlock" xmlns:w16se="http://schemas.microsoft.com/office/word/2015/wordml/symex" xmlns:wpg="http://schemas.microsoft.com/office/word/2010/wordprocessingGroup" xmlns:wpi="http://schemas.microsoft.com/office/word/2010/wordprocessingInk" xmlns:wne="http://schemas.microsoft.com/office/word/2006/wordml" xmlns:wps="http://schemas.microsoft.com/office/word/2010/wordprocessingShape" mc:Ignorable="w14 w15 w16se w16cid w16 w16cex w16sdtdh w16sdtfl w16du wp14">
   <w:p/>
 </w:hdr>
 </file>
 
 <file path=word/numbering.xml><?xml version="1.0" encoding="utf-8"?>
-<w:numbering xmlns:wpc="http://schemas.microsoft.com/office/word/2010/wordprocessingCanvas" xmlns:cx="http://schemas.microsoft.com/office/drawing/2014/chartex" xmlns:cx1="http://schemas.microsoft.com/office/drawing/2015/9/8/chartex" xmlns:cx2="http://schemas.microsoft.com/office/drawing/2015/10/21/chartex" xmlns:cx3="http://schemas.microsoft.com/office/drawing/2016/5/9/chartex" xmlns:cx4="http://schemas.microsoft.com/office/drawing/2016/5/10/chartex" xmlns:cx5="http://schemas.microsoft.com/office/drawing/2016/5/11/chartex" xmlns:cx6="http://schemas.microsoft.com/office/drawing/2016/5/12/chartex" xmlns:cx7="http://schemas.microsoft.com/office/drawing/2016/5/13/chartex" xmlns:cx8="http://schemas.microsoft.com/office/drawing/2016/5/14/chartex" xmlns:mc="http://schemas.openxmlformats.org/markup-compatibility/2006" xmlns:aink="http://schemas.microsoft.com/office/drawing/2016/ink" xmlns:am3d="http://schemas.microsoft.com/office/drawing/2017/model3d" xmlns:o="urn:schemas-microsoft-com:office:office" xmlns:oel="http://schemas.microsoft.com/office/2019/extlst" xmlns:r="http://schemas.openxmlformats.org/officeDocument/2006/relationships" xmlns:m="http://schemas.openxmlformats.org/officeDocument/2006/math" xmlns:v="urn:schemas-microsoft-com:vml" xmlns:wp14="http://schemas.microsoft.com/office/word/2010/wordprocessingDrawing" xmlns:wp="http://schemas.openxmlformats.org/drawingml/2006/wordprocessingDrawing" xmlns:w10="urn:schemas-microsoft-com:office:word" xmlns:w="http://schemas.openxmlformats.org/wordprocessingml/2006/main" xmlns:w14="http://schemas.microsoft.com/office/word/2010/wordml" xmlns:w15="http://schemas.microsoft.com/office/word/2012/wordml" xmlns:w16cex="http://schemas.microsoft.com/office/word/2018/wordml/cex" xmlns:w16cid="http://schemas.microsoft.com/office/word/2016/wordml/cid" xmlns:w16="http://schemas.microsoft.com/office/word/2018/wordml" xmlns:w16du="http://schemas.microsoft.com/office/word/2023/wordml/word16du" xmlns:w16sdtdh="http://schemas.microsoft.com/office/word/2020/wordml/sdtdatahash" xmlns:w16sdtfl="http://schemas.microsoft.com/office/word/2024/wordml/sdtformatlock" xmlns:w16se="http://schemas.microsoft.com/office/word/2015/wordml/symex" xmlns:wpg="http://schemas.microsoft.com/office/word/2010/wordprocessingGroup" xmlns:wpi="http://schemas.microsoft.com/office/word/2010/wordprocessingInk" xmlns:wne="http://schemas.microsoft.com/office/word/2006/wordml" xmlns:wps="http://schemas.microsoft.com/office/word/2010/wordprocessingShape" mc:Ignorable="w14 w15 w16se w16cid w16 w16cex w16sdtdh w16sdtfl w16du wp14">
+<w:numbering xmlns:wpc="http://schemas.microsoft.com/office/word/2010/wordprocessingCanvas" xmlns:cx="http://schemas.microsoft.com/office/drawing/2014/chartex" xmlns:cx1="http://schemas.microsoft.com/office/drawing/2015/9/8/chartex" xmlns:cx2="http://schemas.microsoft.com/office/drawing/2015/10/21/chartex" xmlns:cx3="http://schemas.microsoft.com/office/drawing/2016/5/9/chartex" xmlns:cx4="http://schemas.microsoft.com/office/drawing/2016/5/10/chartex" xmlns:cx5="http://schemas.microsoft.com/office/drawing/2016/5/11/chartex" xmlns:cx6="http://schemas.microsoft.com/office/drawing/2016/5/12/chartex" xmlns:cx7="http://schemas.microsoft.com/office/drawing/2016/5/13/chartex" xmlns:cx8="http://schemas.microsoft.com/office/drawing/2016/5/14/chartex" xmlns:mc="http://schemas.openxmlformats.org/markup-compatibility/2006" xmlns:aink="http://schemas.microsoft.com/office/drawing/2016/ink" xmlns:am3d="http://schemas.microsoft.com/office/drawing/2017/model3d" xmlns:o="urn:schemas-microsoft-com:office:office" xmlns:oel="http://schemas.microsoft.com/office/2019/extlst" xmlns:r="http://schemas.openxmlformats.org/officeDocument/2006/relationships" xmlns:m="http://schemas.openxmlformats.org/officeDocument/2006/math" xmlns:v="urn:schemas-microsoft-com:vml" xmlns:wp14="http://schemas.microsoft.com/office/word/2010/wordprocessingDrawing" xmlns:wp="http://schemas.openxmlformats.org/drawingml/2006/wordprocessingDrawing" xmlns:w10="urn:schemas-microsoft-com:office:word" xmlns:w="http://schemas.openxmlformats.org/wordprocessingml/2006/main" xmlns:w14="http://schemas.microsoft.com/office/word/2010/wordml" xmlns:w15="http://schemas.microsoft.com/office/word/2012/wordml" xmlns:w16cei="http://schemas.microsoft.com/office/word/2026/wordml/cei" xmlns:w16cex="http://schemas.microsoft.com/office/word/2018/wordml/cex" xmlns:w16cid="http://schemas.microsoft.com/office/word/2016/wordml/cid" xmlns:w16="http://schemas.microsoft.com/office/word/2018/wordml" xmlns:w16du="http://schemas.microsoft.com/office/word/2023/wordml/word16du" xmlns:w16sdtdh="http://schemas.microsoft.com/office/word/2020/wordml/sdtdatahash" xmlns:w16sdtfl="http://schemas.microsoft.com/office/word/2024/wordml/sdtformatlock" xmlns:w16se="http://schemas.microsoft.com/office/word/2015/wordml/symex" xmlns:wpg="http://schemas.microsoft.com/office/word/2010/wordprocessingGroup" xmlns:wpi="http://schemas.microsoft.com/office/word/2010/wordprocessingInk" xmlns:wne="http://schemas.microsoft.com/office/word/2006/wordml" xmlns:wps="http://schemas.microsoft.com/office/word/2010/wordprocessingShape" mc:Ignorable="w14 w15 w16se w16cid w16 w16cex w16sdtdh w16sdtfl w16du wp14">
   <w:abstractNum w:abstractNumId="0" w15:restartNumberingAfterBreak="0">
     <w:nsid w:val="27AB7C68"/>
     <w:multiLevelType w:val="multilevel"/>
@@ -2272,7 +2303,6 @@
   <w:style w:type="character" w:default="1" w:styleId="DefaultParagraphFont">
     <w:name w:val="Default Paragraph Font"/>
     <w:uiPriority w:val="1"/>
-    <w:semiHidden/>
     <w:unhideWhenUsed/>
   </w:style>
   <w:style w:type="table" w:default="1" w:styleId="TableNormal">
@@ -2378,29 +2408,6 @@
         <w:vAlign w:val="center"/>
       </w:tcPr>
     </w:tblStylePr>
-  </w:style>
-  <w:style w:type="character" w:styleId="Hyperlink">
-    <w:name w:val="Hyperlink"/>
-    <w:basedOn w:val="DefaultParagraphFont"/>
-    <w:uiPriority w:val="99"/>
-    <w:unhideWhenUsed/>
-    <w:rsid w:val="00392897"/>
-    <w:rPr>
-      <w:color w:val="0000FF" w:themeColor="hyperlink"/>
-      <w:u w:val="single"/>
-    </w:rPr>
-  </w:style>
-  <w:style w:type="character" w:styleId="UnresolvedMention">
-    <w:name w:val="Unresolved Mention"/>
-    <w:basedOn w:val="DefaultParagraphFont"/>
-    <w:uiPriority w:val="99"/>
-    <w:semiHidden/>
-    <w:unhideWhenUsed/>
-    <w:rsid w:val="00392897"/>
-    <w:rPr>
-      <w:color w:val="605E5C"/>
-      <w:shd w:val="clear" w:color="auto" w:fill="E1DFDD"/>
-    </w:rPr>
   </w:style>
 </w:styles>
 </file>

</xml_diff>